<commit_message>
Update satellite processing dataset and 4-epoch maps
</commit_message>
<xml_diff>
--- a/Detailed_SIWES_IT_Report_ASTAL.docx
+++ b/Detailed_SIWES_IT_Report_ASTAL.docx
@@ -4,6 +4,71 @@
   <w:body>
     <w:p>
       <w:pPr>
+        <w:spacing w:before="10" w:after="10" w:line="360" w:lineRule="auto"/>
+        <w:jc w:val="center"/>
+        <w:rPr>
+          <w:rFonts w:cs="Times New Roman"/>
+          <w:b/>
+          <w:szCs w:val="24"/>
+        </w:rPr>
+      </w:pPr>
+      <w:r>
+        <w:rPr>
+          <w:rFonts w:cs="Times New Roman"/>
+          <w:b/>
+          <w:szCs w:val="24"/>
+        </w:rPr>
+        <w:t>A TECHNICAL</w:t>
+      </w:r>
+      <w:r>
+        <w:rPr>
+          <w:rFonts w:cs="Times New Roman"/>
+          <w:b/>
+          <w:szCs w:val="24"/>
+        </w:rPr>
+        <w:t xml:space="preserve"> RE</w:t>
+      </w:r>
+      <w:bookmarkStart w:id="0" w:name="_GoBack"/>
+      <w:bookmarkEnd w:id="0"/>
+      <w:r>
+        <w:rPr>
+          <w:rFonts w:cs="Times New Roman"/>
+          <w:b/>
+          <w:szCs w:val="24"/>
+        </w:rPr>
+        <w:t>PORT ON THE STUDENTS INDUSTRIAL</w:t>
+      </w:r>
+      <w:r>
+        <w:rPr>
+          <w:rFonts w:cs="Times New Roman"/>
+          <w:b/>
+          <w:szCs w:val="24"/>
+        </w:rPr>
+        <w:br/>
+        <w:t>WORK EXPERIENCE SCHEME (SIWES)</w:t>
+      </w:r>
+    </w:p>
+    <w:p>
+      <w:pPr>
+        <w:spacing w:before="10" w:after="10" w:line="360" w:lineRule="auto"/>
+        <w:jc w:val="center"/>
+        <w:rPr>
+          <w:rFonts w:cs="Times New Roman"/>
+          <w:b/>
+          <w:szCs w:val="24"/>
+        </w:rPr>
+      </w:pPr>
+      <w:r>
+        <w:rPr>
+          <w:rFonts w:cs="Times New Roman"/>
+          <w:b/>
+          <w:szCs w:val="24"/>
+        </w:rPr>
+        <w:t>UNDERTAKEN AT</w:t>
+      </w:r>
+    </w:p>
+    <w:p>
+      <w:pPr>
         <w:spacing w:before="10" w:after="10" w:line="480" w:lineRule="auto"/>
         <w:jc w:val="center"/>
         <w:rPr>
@@ -16,22 +81,113 @@
         <w:rPr>
           <w:rFonts w:cs="Times New Roman"/>
           <w:b/>
-          <w:szCs w:val="24"/>
-        </w:rPr>
-        <w:t xml:space="preserve"> REPORT ON THE STUDENTS INDUSTRIAL</w:t>
-      </w:r>
-      <w:r>
-        <w:rPr>
-          <w:rFonts w:cs="Times New Roman"/>
-          <w:b/>
-          <w:szCs w:val="24"/>
-        </w:rPr>
-        <w:br/>
-        <w:t>WORK EXPERIENCE SCHEME (SIWES)</w:t>
+          <w:noProof/>
+          <w:szCs w:val="24"/>
+        </w:rPr>
+        <w:drawing>
+          <wp:inline distT="0" distB="0" distL="0" distR="0">
+            <wp:extent cx="1638300" cy="1143000"/>
+            <wp:effectExtent l="0" t="0" r="0" b="0"/>
+            <wp:docPr id="1" name="Picture 1"/>
+            <wp:cNvGraphicFramePr>
+              <a:graphicFrameLocks xmlns:a="http://schemas.openxmlformats.org/drawingml/2006/main" noChangeAspect="1"/>
+            </wp:cNvGraphicFramePr>
+            <a:graphic xmlns:a="http://schemas.openxmlformats.org/drawingml/2006/main">
+              <a:graphicData uri="http://schemas.openxmlformats.org/drawingml/2006/picture">
+                <pic:pic xmlns:pic="http://schemas.openxmlformats.org/drawingml/2006/picture">
+                  <pic:nvPicPr>
+                    <pic:cNvPr id="0" name="WhatsApp Image 2026-10-05 at 11.44.02 AM.jpeg"/>
+                    <pic:cNvPicPr/>
+                  </pic:nvPicPr>
+                  <pic:blipFill>
+                    <a:blip r:embed="rId9">
+                      <a:extLst>
+                        <a:ext uri="{28A0092B-C50C-407E-A947-70E740481C1C}">
+                          <a14:useLocalDpi xmlns:a14="http://schemas.microsoft.com/office/drawing/2010/main" val="0"/>
+                        </a:ext>
+                      </a:extLst>
+                    </a:blip>
+                    <a:stretch>
+                      <a:fillRect/>
+                    </a:stretch>
+                  </pic:blipFill>
+                  <pic:spPr>
+                    <a:xfrm>
+                      <a:off x="0" y="0"/>
+                      <a:ext cx="1640198" cy="1144324"/>
+                    </a:xfrm>
+                    <a:prstGeom prst="rect">
+                      <a:avLst/>
+                    </a:prstGeom>
+                  </pic:spPr>
+                </pic:pic>
+              </a:graphicData>
+            </a:graphic>
+          </wp:inline>
+        </w:drawing>
       </w:r>
     </w:p>
     <w:p>
       <w:pPr>
+        <w:spacing w:before="10" w:after="10" w:line="360" w:lineRule="auto"/>
+        <w:jc w:val="center"/>
+        <w:rPr>
+          <w:rFonts w:cs="Times New Roman"/>
+          <w:b/>
+          <w:szCs w:val="24"/>
+        </w:rPr>
+      </w:pPr>
+      <w:r>
+        <w:rPr>
+          <w:rFonts w:cs="Times New Roman"/>
+          <w:b/>
+          <w:szCs w:val="24"/>
+        </w:rPr>
+        <w:t>ADVANCED SPACE TECHNOLOGY AND APPLICATIONS LABORATORIES (ASTAL</w:t>
+      </w:r>
+      <w:proofErr w:type="gramStart"/>
+      <w:r>
+        <w:rPr>
+          <w:rFonts w:cs="Times New Roman"/>
+          <w:b/>
+          <w:szCs w:val="24"/>
+        </w:rPr>
+        <w:t>)</w:t>
+      </w:r>
+      <w:proofErr w:type="gramEnd"/>
+      <w:r>
+        <w:rPr>
+          <w:rFonts w:cs="Times New Roman"/>
+          <w:b/>
+          <w:szCs w:val="24"/>
+        </w:rPr>
+        <w:br/>
+        <w:t>UYO, AKWA IBOM STATE</w:t>
+      </w:r>
+    </w:p>
+    <w:p>
+      <w:pPr>
+        <w:tabs>
+          <w:tab w:val="left" w:pos="4815"/>
+        </w:tabs>
+        <w:spacing w:before="10" w:after="10" w:line="480" w:lineRule="auto"/>
+        <w:rPr>
+          <w:rFonts w:cs="Times New Roman"/>
+          <w:b/>
+          <w:szCs w:val="24"/>
+        </w:rPr>
+      </w:pPr>
+      <w:r>
+        <w:rPr>
+          <w:rFonts w:cs="Times New Roman"/>
+          <w:b/>
+          <w:szCs w:val="24"/>
+        </w:rPr>
+        <w:tab/>
+      </w:r>
+    </w:p>
+    <w:p>
+      <w:pPr>
         <w:spacing w:before="10" w:after="10" w:line="480" w:lineRule="auto"/>
         <w:jc w:val="center"/>
         <w:rPr>
@@ -46,11 +202,94 @@
           <w:b/>
           <w:szCs w:val="24"/>
         </w:rPr>
-        <w:t>UNDERTAKEN AT</w:t>
+        <w:t>BY</w:t>
       </w:r>
     </w:p>
     <w:p>
       <w:pPr>
+        <w:spacing w:before="10" w:after="10" w:line="360" w:lineRule="auto"/>
+        <w:jc w:val="center"/>
+        <w:rPr>
+          <w:rFonts w:cs="Times New Roman"/>
+          <w:b/>
+          <w:szCs w:val="24"/>
+        </w:rPr>
+      </w:pPr>
+      <w:r>
+        <w:rPr>
+          <w:rFonts w:cs="Times New Roman"/>
+          <w:b/>
+          <w:szCs w:val="24"/>
+        </w:rPr>
+        <w:t>[MARIA-GLORY JUDITH UDOFIA]</w:t>
+      </w:r>
+      <w:r>
+        <w:rPr>
+          <w:rFonts w:cs="Times New Roman"/>
+          <w:b/>
+          <w:szCs w:val="24"/>
+        </w:rPr>
+        <w:br/>
+        <w:t>[2023/SC/CO/110</w:t>
+      </w:r>
+      <w:r>
+        <w:rPr>
+          <w:rFonts w:cs="Times New Roman"/>
+          <w:b/>
+          <w:szCs w:val="24"/>
+        </w:rPr>
+        <w:t>]</w:t>
+      </w:r>
+    </w:p>
+    <w:p>
+      <w:pPr>
+        <w:spacing w:before="10" w:after="10" w:line="360" w:lineRule="auto"/>
+        <w:jc w:val="center"/>
+        <w:rPr>
+          <w:rFonts w:cs="Times New Roman"/>
+          <w:b/>
+          <w:szCs w:val="24"/>
+        </w:rPr>
+      </w:pPr>
+      <w:r>
+        <w:rPr>
+          <w:rFonts w:cs="Times New Roman"/>
+          <w:b/>
+          <w:szCs w:val="24"/>
+        </w:rPr>
+        <w:t>DEPARTMENT OF COMPUTER SCIENCE</w:t>
+      </w:r>
+      <w:proofErr w:type="gramStart"/>
+      <w:r>
+        <w:rPr>
+          <w:rFonts w:cs="Times New Roman"/>
+          <w:b/>
+          <w:szCs w:val="24"/>
+        </w:rPr>
+        <w:t>,</w:t>
+      </w:r>
+      <w:proofErr w:type="gramEnd"/>
+      <w:r>
+        <w:rPr>
+          <w:rFonts w:cs="Times New Roman"/>
+          <w:b/>
+          <w:szCs w:val="24"/>
+        </w:rPr>
+        <w:br/>
+        <w:t>FACULTY OF COMPUTING,</w:t>
+      </w:r>
+      <w:r>
+        <w:rPr>
+          <w:rFonts w:cs="Times New Roman"/>
+          <w:b/>
+          <w:szCs w:val="24"/>
+        </w:rPr>
+        <w:br/>
+        <w:t>UNIVERSITY OF UYO, UYO.</w:t>
+      </w:r>
+    </w:p>
+    <w:p>
+      <w:pPr>
         <w:spacing w:before="10" w:after="10" w:line="480" w:lineRule="auto"/>
         <w:jc w:val="center"/>
         <w:rPr>
@@ -59,36 +298,65 @@
           <w:szCs w:val="24"/>
         </w:rPr>
       </w:pPr>
-      <w:r>
-        <w:rPr>
-          <w:rFonts w:cs="Times New Roman"/>
-          <w:b/>
-          <w:szCs w:val="24"/>
-        </w:rPr>
-        <w:t>ADVANCED SPACE TECHNOLOGY AND APPLICATIONS LABORATORIES (ASTAL</w:t>
-      </w:r>
-      <w:proofErr w:type="gramStart"/>
-      <w:r>
-        <w:rPr>
-          <w:rFonts w:cs="Times New Roman"/>
-          <w:b/>
-          <w:szCs w:val="24"/>
-        </w:rPr>
-        <w:t>)</w:t>
-      </w:r>
-      <w:proofErr w:type="gramEnd"/>
-      <w:r>
-        <w:rPr>
-          <w:rFonts w:cs="Times New Roman"/>
-          <w:b/>
-          <w:szCs w:val="24"/>
-        </w:rPr>
-        <w:br/>
-        <w:t>UYO, AKWA IBOM STATE</w:t>
-      </w:r>
     </w:p>
     <w:p>
       <w:pPr>
+        <w:spacing w:before="10" w:after="10" w:line="360" w:lineRule="auto"/>
+        <w:jc w:val="center"/>
+        <w:rPr>
+          <w:rFonts w:cs="Times New Roman"/>
+          <w:b/>
+          <w:szCs w:val="24"/>
+        </w:rPr>
+      </w:pPr>
+      <w:r>
+        <w:rPr>
+          <w:rFonts w:cs="Times New Roman"/>
+          <w:b/>
+          <w:szCs w:val="24"/>
+        </w:rPr>
+        <w:t>SUBMITTED TO</w:t>
+      </w:r>
+      <w:r>
+        <w:rPr>
+          <w:rFonts w:cs="Times New Roman"/>
+          <w:b/>
+          <w:szCs w:val="24"/>
+        </w:rPr>
+        <w:br/>
+        <w:t>DEPARTMENT OF COMPUTER SCIENCE</w:t>
+      </w:r>
+      <w:proofErr w:type="gramStart"/>
+      <w:r>
+        <w:rPr>
+          <w:rFonts w:cs="Times New Roman"/>
+          <w:b/>
+          <w:szCs w:val="24"/>
+        </w:rPr>
+        <w:t>,</w:t>
+      </w:r>
+      <w:proofErr w:type="gramEnd"/>
+      <w:r>
+        <w:rPr>
+          <w:rFonts w:cs="Times New Roman"/>
+          <w:b/>
+          <w:szCs w:val="24"/>
+        </w:rPr>
+        <w:br/>
+        <w:t>FACULTY OF COMPUTING,</w:t>
+      </w:r>
+      <w:r>
+        <w:rPr>
+          <w:rFonts w:cs="Times New Roman"/>
+          <w:b/>
+          <w:szCs w:val="24"/>
+        </w:rPr>
+        <w:br/>
+        <w:t>UNIVERSITY OF UYO, UYO.</w:t>
+      </w:r>
+    </w:p>
+    <w:p>
+      <w:pPr>
         <w:spacing w:before="10" w:after="10" w:line="480" w:lineRule="auto"/>
         <w:jc w:val="center"/>
         <w:rPr>
@@ -100,6 +368,42 @@
     </w:p>
     <w:p>
       <w:pPr>
+        <w:spacing w:before="10" w:after="10" w:line="360" w:lineRule="auto"/>
+        <w:jc w:val="center"/>
+        <w:rPr>
+          <w:rFonts w:cs="Times New Roman"/>
+          <w:b/>
+          <w:szCs w:val="24"/>
+        </w:rPr>
+      </w:pPr>
+      <w:r>
+        <w:rPr>
+          <w:rFonts w:cs="Times New Roman"/>
+          <w:b/>
+          <w:szCs w:val="24"/>
+        </w:rPr>
+        <w:t>I</w:t>
+      </w:r>
+      <w:r>
+        <w:rPr>
+          <w:rFonts w:cs="Times New Roman"/>
+          <w:b/>
+          <w:szCs w:val="24"/>
+        </w:rPr>
+        <w:t>N PARTIAL FULFILLMENT OF THE REQUIREMENT FOR THE AWARD OF</w:t>
+      </w:r>
+      <w:r>
+        <w:rPr>
+          <w:rFonts w:cs="Times New Roman"/>
+          <w:b/>
+          <w:szCs w:val="24"/>
+        </w:rPr>
+        <w:br/>
+        <w:t>BACHELOR OF SCIENCE (B.Sc.) DEGREE IN COMPUTER SCIENCE</w:t>
+      </w:r>
+    </w:p>
+    <w:p>
+      <w:pPr>
         <w:spacing w:before="10" w:after="10" w:line="480" w:lineRule="auto"/>
         <w:jc w:val="center"/>
         <w:rPr>
@@ -108,14 +412,6 @@
           <w:szCs w:val="24"/>
         </w:rPr>
       </w:pPr>
-      <w:r>
-        <w:rPr>
-          <w:rFonts w:cs="Times New Roman"/>
-          <w:b/>
-          <w:szCs w:val="24"/>
-        </w:rPr>
-        <w:t>BY</w:t>
-      </w:r>
     </w:p>
     <w:p>
       <w:pPr>
@@ -133,7 +429,7 @@
           <w:b/>
           <w:szCs w:val="24"/>
         </w:rPr>
-        <w:t>[MARIA-GLORY JUDITH UDOFIA]</w:t>
+        <w:t>OCTOBER, 2026</w:t>
       </w:r>
       <w:r>
         <w:rPr>
@@ -141,228 +437,8 @@
           <w:b/>
           <w:szCs w:val="24"/>
         </w:rPr>
-        <w:br/>
-        <w:t>[2023/SC/CO/110</w:t>
-      </w:r>
-      <w:r>
-        <w:rPr>
-          <w:rFonts w:cs="Times New Roman"/>
-          <w:b/>
-          <w:szCs w:val="24"/>
-        </w:rPr>
-        <w:t>]</w:t>
-      </w:r>
-    </w:p>
-    <w:p>
-      <w:pPr>
-        <w:spacing w:before="10" w:after="10" w:line="480" w:lineRule="auto"/>
-        <w:jc w:val="center"/>
-        <w:rPr>
-          <w:rFonts w:cs="Times New Roman"/>
-          <w:b/>
-          <w:szCs w:val="24"/>
-        </w:rPr>
-      </w:pPr>
-      <w:r>
-        <w:rPr>
-          <w:rFonts w:cs="Times New Roman"/>
-          <w:b/>
-          <w:szCs w:val="24"/>
-        </w:rPr>
-        <w:t>DEPARTMENT OF COMPUTER SCIENCE</w:t>
-      </w:r>
-      <w:proofErr w:type="gramStart"/>
-      <w:r>
-        <w:rPr>
-          <w:rFonts w:cs="Times New Roman"/>
-          <w:b/>
-          <w:szCs w:val="24"/>
-        </w:rPr>
-        <w:t>,</w:t>
-      </w:r>
-      <w:proofErr w:type="gramEnd"/>
-      <w:r>
-        <w:rPr>
-          <w:rFonts w:cs="Times New Roman"/>
-          <w:b/>
-          <w:szCs w:val="24"/>
-        </w:rPr>
-        <w:br/>
-        <w:t>FACULTY OF COMPUTING,</w:t>
-      </w:r>
-      <w:r>
-        <w:rPr>
-          <w:rFonts w:cs="Times New Roman"/>
-          <w:b/>
-          <w:szCs w:val="24"/>
-        </w:rPr>
-        <w:br/>
-        <w:t>UNIVERSITY OF UYO, UYO.</w:t>
-      </w:r>
-    </w:p>
-    <w:p>
-      <w:pPr>
-        <w:spacing w:before="10" w:after="10" w:line="480" w:lineRule="auto"/>
-        <w:jc w:val="center"/>
-        <w:rPr>
-          <w:rFonts w:cs="Times New Roman"/>
-          <w:b/>
-          <w:szCs w:val="24"/>
-        </w:rPr>
-      </w:pPr>
-    </w:p>
-    <w:p>
-      <w:pPr>
-        <w:spacing w:before="10" w:after="10" w:line="480" w:lineRule="auto"/>
-        <w:jc w:val="center"/>
-        <w:rPr>
-          <w:rFonts w:cs="Times New Roman"/>
-          <w:b/>
-          <w:szCs w:val="24"/>
-        </w:rPr>
-      </w:pPr>
-      <w:r>
-        <w:rPr>
-          <w:rFonts w:cs="Times New Roman"/>
-          <w:b/>
-          <w:szCs w:val="24"/>
-        </w:rPr>
-        <w:t>SUBMITTED TO</w:t>
-      </w:r>
-      <w:r>
-        <w:rPr>
-          <w:rFonts w:cs="Times New Roman"/>
-          <w:b/>
-          <w:szCs w:val="24"/>
-        </w:rPr>
-        <w:br/>
-        <w:t>DEPARTMENT OF COMPUTER SCIENCE</w:t>
-      </w:r>
-      <w:proofErr w:type="gramStart"/>
-      <w:r>
-        <w:rPr>
-          <w:rFonts w:cs="Times New Roman"/>
-          <w:b/>
-          <w:szCs w:val="24"/>
-        </w:rPr>
-        <w:t>,</w:t>
-      </w:r>
-      <w:proofErr w:type="gramEnd"/>
-      <w:r>
-        <w:rPr>
-          <w:rFonts w:cs="Times New Roman"/>
-          <w:b/>
-          <w:szCs w:val="24"/>
-        </w:rPr>
-        <w:br/>
-        <w:t>FACULTY OF COMPUTING,</w:t>
-      </w:r>
-      <w:r>
-        <w:rPr>
-          <w:rFonts w:cs="Times New Roman"/>
-          <w:b/>
-          <w:szCs w:val="24"/>
-        </w:rPr>
-        <w:br/>
-        <w:t>UNIVERSITY OF UYO, UYO.</w:t>
-      </w:r>
-    </w:p>
-    <w:p>
-      <w:pPr>
-        <w:spacing w:before="10" w:after="10" w:line="480" w:lineRule="auto"/>
-        <w:jc w:val="center"/>
-        <w:rPr>
-          <w:rFonts w:cs="Times New Roman"/>
-          <w:b/>
-          <w:szCs w:val="24"/>
-        </w:rPr>
-      </w:pPr>
-    </w:p>
-    <w:p>
-      <w:pPr>
-        <w:spacing w:before="10" w:after="10" w:line="480" w:lineRule="auto"/>
-        <w:jc w:val="center"/>
-        <w:rPr>
-          <w:rFonts w:cs="Times New Roman"/>
-          <w:b/>
-          <w:szCs w:val="24"/>
-        </w:rPr>
-      </w:pPr>
-      <w:r>
-        <w:rPr>
-          <w:rFonts w:cs="Times New Roman"/>
-          <w:b/>
-          <w:szCs w:val="24"/>
-        </w:rPr>
-        <w:t>I</w:t>
-      </w:r>
-      <w:r>
-        <w:rPr>
-          <w:rFonts w:cs="Times New Roman"/>
-          <w:b/>
-          <w:szCs w:val="24"/>
-        </w:rPr>
-        <w:t>N PARTIAL FULFILLMENT OF THE REQUIREMENT FOR THE AWARD OF</w:t>
-      </w:r>
-      <w:r>
-        <w:rPr>
-          <w:rFonts w:cs="Times New Roman"/>
-          <w:b/>
-          <w:szCs w:val="24"/>
-        </w:rPr>
-        <w:br/>
-        <w:t>BACHELOR OF SCIENCE (B.Sc.) DEGREE IN COMPUTER SCIENCE</w:t>
-      </w:r>
-    </w:p>
-    <w:p>
-      <w:pPr>
-        <w:spacing w:before="10" w:after="10" w:line="480" w:lineRule="auto"/>
-        <w:jc w:val="center"/>
-        <w:rPr>
-          <w:rFonts w:cs="Times New Roman"/>
-          <w:b/>
-          <w:szCs w:val="24"/>
-        </w:rPr>
-      </w:pPr>
-    </w:p>
-    <w:p>
-      <w:pPr>
-        <w:spacing w:before="10" w:after="10" w:line="480" w:lineRule="auto"/>
-        <w:jc w:val="center"/>
-        <w:rPr>
-          <w:rFonts w:cs="Times New Roman"/>
-          <w:b/>
-          <w:szCs w:val="24"/>
-        </w:rPr>
-      </w:pPr>
-      <w:r>
-        <w:rPr>
-          <w:rFonts w:cs="Times New Roman"/>
-          <w:b/>
-          <w:szCs w:val="24"/>
-        </w:rPr>
-        <w:t>OCTOBER, 2026</w:t>
-      </w:r>
-    </w:p>
-    <w:p>
-      <w:pPr>
-        <w:spacing w:before="10" w:after="10" w:line="480" w:lineRule="auto"/>
-        <w:jc w:val="both"/>
-        <w:rPr>
-          <w:rFonts w:cs="Times New Roman"/>
-          <w:szCs w:val="24"/>
-        </w:rPr>
-      </w:pPr>
-    </w:p>
-    <w:p>
-      <w:pPr>
-        <w:spacing w:before="10" w:after="10" w:line="480" w:lineRule="auto"/>
-        <w:jc w:val="both"/>
-        <w:rPr>
-          <w:rFonts w:cs="Times New Roman"/>
-          <w:szCs w:val="24"/>
-        </w:rPr>
-      </w:pPr>
+        <w:t>.</w:t>
+      </w:r>
     </w:p>
     <w:p>
       <w:pPr>
@@ -379,6 +455,7 @@
           <w:rFonts w:ascii="Times New Roman" w:hAnsi="Times New Roman" w:cs="Times New Roman"/>
           <w:color w:val="000000" w:themeColor="text1"/>
         </w:rPr>
+        <w:lastRenderedPageBreak/>
         <w:t>DEDICATION</w:t>
       </w:r>
     </w:p>
@@ -997,7 +1074,7 @@
           <w:szCs w:val="28"/>
         </w:rPr>
         <w:lastRenderedPageBreak/>
-        <w:t>Table of Content</w:t>
+        <w:t>TABLE OF CONTENTS</w:t>
       </w:r>
     </w:p>
     <w:p>
@@ -1005,18 +1082,40 @@
         <w:rPr>
           <w:rFonts w:cs="Times New Roman"/>
           <w:b/>
-          <w:sz w:val="28"/>
-          <w:szCs w:val="28"/>
+          <w:szCs w:val="24"/>
         </w:rPr>
       </w:pPr>
       <w:r>
         <w:rPr>
           <w:rFonts w:cs="Times New Roman"/>
           <w:b/>
-          <w:sz w:val="28"/>
-          <w:szCs w:val="28"/>
-        </w:rPr>
-        <w:t>Title page</w:t>
+          <w:szCs w:val="24"/>
+        </w:rPr>
+        <w:t>TITLE PAGE .......................</w:t>
+      </w:r>
+      <w:r>
+        <w:rPr>
+          <w:rFonts w:cs="Times New Roman"/>
+          <w:b/>
+          <w:szCs w:val="24"/>
+        </w:rPr>
+        <w:t>.........................</w:t>
+      </w:r>
+      <w:r>
+        <w:rPr>
+          <w:rFonts w:cs="Times New Roman"/>
+          <w:b/>
+          <w:szCs w:val="24"/>
+        </w:rPr>
+        <w:t>................................................................</w:t>
+      </w:r>
+      <w:r>
+        <w:rPr>
+          <w:rFonts w:cs="Times New Roman"/>
+          <w:b/>
+          <w:szCs w:val="24"/>
+        </w:rPr>
+        <w:t>i</w:t>
       </w:r>
     </w:p>
     <w:p>
@@ -1024,18 +1123,32 @@
         <w:rPr>
           <w:rFonts w:cs="Times New Roman"/>
           <w:b/>
-          <w:sz w:val="28"/>
-          <w:szCs w:val="28"/>
+          <w:szCs w:val="24"/>
         </w:rPr>
       </w:pPr>
       <w:r>
         <w:rPr>
           <w:rFonts w:cs="Times New Roman"/>
           <w:b/>
-          <w:sz w:val="28"/>
-          <w:szCs w:val="28"/>
-        </w:rPr>
-        <w:t>Dedication</w:t>
+          <w:szCs w:val="24"/>
+        </w:rPr>
+        <w:t>DEDICATION .........................</w:t>
+      </w:r>
+      <w:r>
+        <w:rPr>
+          <w:rFonts w:cs="Times New Roman"/>
+          <w:b/>
+          <w:szCs w:val="24"/>
+        </w:rPr>
+        <w:t>.....................................................................................</w:t>
+      </w:r>
+      <w:r>
+        <w:rPr>
+          <w:rFonts w:cs="Times New Roman"/>
+          <w:b/>
+          <w:szCs w:val="24"/>
+        </w:rPr>
+        <w:t>ii</w:t>
       </w:r>
     </w:p>
     <w:p>
@@ -1043,18 +1156,32 @@
         <w:rPr>
           <w:rFonts w:cs="Times New Roman"/>
           <w:b/>
-          <w:sz w:val="28"/>
-          <w:szCs w:val="28"/>
+          <w:szCs w:val="24"/>
         </w:rPr>
       </w:pPr>
       <w:r>
         <w:rPr>
           <w:rFonts w:cs="Times New Roman"/>
           <w:b/>
-          <w:sz w:val="28"/>
-          <w:szCs w:val="28"/>
-        </w:rPr>
-        <w:t>Acknowledgement</w:t>
+          <w:szCs w:val="24"/>
+        </w:rPr>
+        <w:t>ACKNOWLEDGEMENTS ...................</w:t>
+      </w:r>
+      <w:r>
+        <w:rPr>
+          <w:rFonts w:cs="Times New Roman"/>
+          <w:b/>
+          <w:szCs w:val="24"/>
+        </w:rPr>
+        <w:t>.....................................................................</w:t>
+      </w:r>
+      <w:r>
+        <w:rPr>
+          <w:rFonts w:cs="Times New Roman"/>
+          <w:b/>
+          <w:szCs w:val="24"/>
+        </w:rPr>
+        <w:t>iii</w:t>
       </w:r>
     </w:p>
     <w:p>
@@ -1062,37 +1189,67 @@
         <w:rPr>
           <w:rFonts w:cs="Times New Roman"/>
           <w:b/>
-          <w:sz w:val="28"/>
-          <w:szCs w:val="28"/>
+          <w:szCs w:val="24"/>
         </w:rPr>
       </w:pPr>
       <w:r>
         <w:rPr>
           <w:rFonts w:cs="Times New Roman"/>
           <w:b/>
-          <w:sz w:val="28"/>
-          <w:szCs w:val="28"/>
-        </w:rPr>
-        <w:t>Abstract</w:t>
-      </w:r>
+          <w:szCs w:val="24"/>
+        </w:rPr>
+        <w:t>ABSTRACT ..........................</w:t>
+      </w:r>
+      <w:r>
+        <w:rPr>
+          <w:rFonts w:cs="Times New Roman"/>
+          <w:b/>
+          <w:szCs w:val="24"/>
+        </w:rPr>
+        <w:t>........................................................................................</w:t>
+      </w:r>
+      <w:proofErr w:type="gramStart"/>
+      <w:r>
+        <w:rPr>
+          <w:rFonts w:cs="Times New Roman"/>
+          <w:b/>
+          <w:szCs w:val="24"/>
+        </w:rPr>
+        <w:t>iv</w:t>
+      </w:r>
+      <w:proofErr w:type="gramEnd"/>
     </w:p>
     <w:p>
       <w:pPr>
         <w:rPr>
           <w:rFonts w:cs="Times New Roman"/>
           <w:b/>
-          <w:sz w:val="28"/>
-          <w:szCs w:val="28"/>
+          <w:szCs w:val="24"/>
         </w:rPr>
       </w:pPr>
       <w:r>
         <w:rPr>
           <w:rFonts w:cs="Times New Roman"/>
           <w:b/>
-          <w:sz w:val="28"/>
-          <w:szCs w:val="28"/>
-        </w:rPr>
-        <w:t>Introduction</w:t>
+          <w:szCs w:val="24"/>
+        </w:rPr>
+        <w:t>INTRODUCTION .......................</w:t>
+      </w:r>
+      <w:r>
+        <w:rPr>
+          <w:rFonts w:cs="Times New Roman"/>
+          <w:b/>
+          <w:szCs w:val="24"/>
+        </w:rPr>
+        <w:t>..................................................................................</w:t>
+      </w:r>
+      <w:r>
+        <w:rPr>
+          <w:rFonts w:cs="Times New Roman"/>
+          <w:b/>
+          <w:szCs w:val="24"/>
+        </w:rPr>
+        <w:t>v</w:t>
       </w:r>
     </w:p>
     <w:p>
@@ -1100,47 +1257,885 @@
         <w:rPr>
           <w:rFonts w:cs="Times New Roman"/>
           <w:b/>
-          <w:sz w:val="28"/>
-          <w:szCs w:val="28"/>
-        </w:rPr>
-      </w:pPr>
+          <w:szCs w:val="24"/>
+        </w:rPr>
+      </w:pPr>
+      <w:r>
+        <w:rPr>
+          <w:rFonts w:cs="Times New Roman"/>
+          <w:b/>
+          <w:szCs w:val="24"/>
+        </w:rPr>
+        <w:t>TABLE OF CONTENTS .....................</w:t>
+      </w:r>
+      <w:r>
+        <w:rPr>
+          <w:rFonts w:cs="Times New Roman"/>
+          <w:b/>
+          <w:szCs w:val="24"/>
+        </w:rPr>
+        <w:t>........................................................................</w:t>
+      </w:r>
+      <w:proofErr w:type="gramStart"/>
+      <w:r>
+        <w:rPr>
+          <w:rFonts w:cs="Times New Roman"/>
+          <w:b/>
+          <w:szCs w:val="24"/>
+        </w:rPr>
+        <w:t>vi</w:t>
+      </w:r>
+      <w:proofErr w:type="gramEnd"/>
     </w:p>
     <w:p>
       <w:pPr>
         <w:rPr>
           <w:rFonts w:cs="Times New Roman"/>
           <w:b/>
-          <w:sz w:val="28"/>
-          <w:szCs w:val="28"/>
+          <w:szCs w:val="24"/>
         </w:rPr>
       </w:pPr>
       <w:r>
         <w:rPr>
           <w:rFonts w:cs="Times New Roman"/>
           <w:b/>
-          <w:sz w:val="28"/>
-          <w:szCs w:val="28"/>
-        </w:rPr>
-        <w:br w:type="page"/>
+          <w:szCs w:val="24"/>
+        </w:rPr>
+        <w:t xml:space="preserve">CHAPTER 1: INTRODUCTION TO SIWES PROGRAM </w:t>
+      </w:r>
+      <w:r>
+        <w:rPr>
+          <w:rFonts w:cs="Times New Roman"/>
+          <w:b/>
+          <w:szCs w:val="24"/>
+        </w:rPr>
+        <w:t>......................................</w:t>
+      </w:r>
+      <w:r>
+        <w:rPr>
+          <w:rFonts w:cs="Times New Roman"/>
+          <w:b/>
+          <w:szCs w:val="24"/>
+        </w:rPr>
+        <w:t>1</w:t>
       </w:r>
     </w:p>
     <w:p>
       <w:pPr>
         <w:rPr>
-          <w:rFonts w:eastAsiaTheme="majorEastAsia" w:cs="Times New Roman"/>
+          <w:rFonts w:cs="Times New Roman"/>
           <w:b/>
-          <w:bCs/>
-          <w:color w:val="365F91" w:themeColor="accent1" w:themeShade="BF"/>
-          <w:szCs w:val="24"/>
-        </w:rPr>
-      </w:pPr>
-      <w:r>
-        <w:rPr>
-          <w:rFonts w:cs="Times New Roman"/>
+          <w:szCs w:val="24"/>
+        </w:rPr>
+      </w:pPr>
+      <w:r>
+        <w:rPr>
+          <w:rFonts w:cs="Times New Roman"/>
+          <w:b/>
+          <w:szCs w:val="24"/>
+        </w:rPr>
+        <w:t>1.1 BACKGROUND OF THE SIWES PROGRAM</w:t>
+      </w:r>
+    </w:p>
+    <w:p>
+      <w:pPr>
+        <w:rPr>
+          <w:rFonts w:cs="Times New Roman"/>
+          <w:b/>
+          <w:szCs w:val="24"/>
+        </w:rPr>
+      </w:pPr>
+      <w:r>
+        <w:rPr>
+          <w:rFonts w:cs="Times New Roman"/>
+          <w:b/>
+          <w:szCs w:val="24"/>
+        </w:rPr>
+        <w:t>1.2 ABOUT ADVANCED SPACE TECHNOLOGY AND APPLICATIONS</w:t>
+      </w:r>
+    </w:p>
+    <w:p>
+      <w:pPr>
+        <w:rPr>
+          <w:rFonts w:cs="Times New Roman"/>
+          <w:b/>
+          <w:szCs w:val="24"/>
+        </w:rPr>
+      </w:pPr>
+      <w:r>
+        <w:rPr>
+          <w:rFonts w:cs="Times New Roman"/>
+          <w:b/>
+          <w:szCs w:val="24"/>
+        </w:rPr>
+        <w:t>LABORATORIES (ASTAL), UYO</w:t>
+      </w:r>
+    </w:p>
+    <w:p>
+      <w:pPr>
+        <w:rPr>
+          <w:rFonts w:cs="Times New Roman"/>
+          <w:b/>
+          <w:szCs w:val="24"/>
+        </w:rPr>
+      </w:pPr>
+      <w:r>
+        <w:rPr>
+          <w:rFonts w:cs="Times New Roman"/>
+          <w:b/>
+          <w:szCs w:val="24"/>
+        </w:rPr>
+        <w:t>1.3 HISTORY, VISION, MISSION, AND CORE VALUES OF ASTAL</w:t>
+      </w:r>
+    </w:p>
+    <w:p>
+      <w:pPr>
+        <w:rPr>
+          <w:rFonts w:cs="Times New Roman"/>
+          <w:b/>
+          <w:szCs w:val="24"/>
+        </w:rPr>
+      </w:pPr>
+      <w:r>
+        <w:rPr>
+          <w:rFonts w:cs="Times New Roman"/>
+          <w:b/>
+          <w:szCs w:val="24"/>
+        </w:rPr>
+        <w:t>1.4 ORGANIZATIONAL STRUCTURE AND UNIT ATTACHMENT</w:t>
+      </w:r>
+    </w:p>
+    <w:p>
+      <w:pPr>
+        <w:rPr>
+          <w:rFonts w:cs="Times New Roman"/>
+          <w:b/>
+          <w:szCs w:val="24"/>
+        </w:rPr>
+      </w:pPr>
+      <w:r>
+        <w:rPr>
+          <w:rFonts w:cs="Times New Roman"/>
+          <w:b/>
+          <w:szCs w:val="24"/>
+        </w:rPr>
+        <w:t>1.5 D</w:t>
+      </w:r>
+      <w:r>
+        <w:rPr>
+          <w:rFonts w:cs="Times New Roman"/>
+          <w:b/>
+          <w:szCs w:val="24"/>
+        </w:rPr>
+        <w:t>URATION AND SCOPE OF INTERNSHIP</w:t>
+      </w:r>
+    </w:p>
+    <w:p>
+      <w:pPr>
+        <w:rPr>
+          <w:rFonts w:cs="Times New Roman"/>
+          <w:b/>
+          <w:szCs w:val="24"/>
+        </w:rPr>
+      </w:pPr>
+      <w:r>
+        <w:rPr>
+          <w:rFonts w:cs="Times New Roman"/>
+          <w:b/>
+          <w:szCs w:val="24"/>
+        </w:rPr>
+        <w:t>CHAPTER 2: PRACTICAL SKILLS ACQUIRED DURING SIWES ...................... 9</w:t>
+      </w:r>
+    </w:p>
+    <w:p>
+      <w:pPr>
+        <w:rPr>
+          <w:rFonts w:cs="Times New Roman"/>
+          <w:b/>
+          <w:szCs w:val="24"/>
+        </w:rPr>
+      </w:pPr>
+      <w:r>
+        <w:rPr>
+          <w:rFonts w:cs="Times New Roman"/>
+          <w:b/>
+          <w:szCs w:val="24"/>
+        </w:rPr>
+        <w:t>2.1 ORIENTATION, SPACE TECHNOLOGY FOUNDATIONS, AND NIGERIAN</w:t>
+      </w:r>
+    </w:p>
+    <w:p>
+      <w:pPr>
+        <w:rPr>
+          <w:rFonts w:cs="Times New Roman"/>
+          <w:b/>
+          <w:szCs w:val="24"/>
+        </w:rPr>
+      </w:pPr>
+      <w:r>
+        <w:rPr>
+          <w:rFonts w:cs="Times New Roman"/>
+          <w:b/>
+          <w:szCs w:val="24"/>
+        </w:rPr>
+        <w:t>SATELLITE SYSTEMS (WEEKS 1–2)</w:t>
+      </w:r>
+    </w:p>
+    <w:p>
+      <w:pPr>
+        <w:rPr>
+          <w:rFonts w:cs="Times New Roman"/>
+          <w:b/>
+          <w:szCs w:val="24"/>
+        </w:rPr>
+      </w:pPr>
+      <w:r>
+        <w:rPr>
+          <w:rFonts w:cs="Times New Roman"/>
+          <w:b/>
+          <w:szCs w:val="24"/>
+        </w:rPr>
+        <w:t>2.2 CARTOGRAPHY, SPATIAL DATA MODELS, AND COORDINATE</w:t>
+      </w:r>
+    </w:p>
+    <w:p>
+      <w:pPr>
+        <w:rPr>
+          <w:rFonts w:cs="Times New Roman"/>
+          <w:b/>
+          <w:szCs w:val="24"/>
+        </w:rPr>
+      </w:pPr>
+      <w:r>
+        <w:rPr>
+          <w:rFonts w:cs="Times New Roman"/>
+          <w:b/>
+          <w:szCs w:val="24"/>
+        </w:rPr>
+        <w:t>REFERENCE SYSTEMS (WEEKS 3–5)</w:t>
+      </w:r>
+    </w:p>
+    <w:p>
+      <w:pPr>
+        <w:rPr>
+          <w:rFonts w:cs="Times New Roman"/>
+          <w:b/>
+          <w:szCs w:val="24"/>
+        </w:rPr>
+      </w:pPr>
+      <w:r>
+        <w:rPr>
+          <w:rFonts w:cs="Times New Roman"/>
+          <w:b/>
+          <w:szCs w:val="24"/>
+        </w:rPr>
+        <w:t>2.3 GEOREFERENCING, GEOPROCESSING, AND IMAGE CLASSIFICATION</w:t>
+      </w:r>
+    </w:p>
+    <w:p>
+      <w:pPr>
+        <w:rPr>
+          <w:rFonts w:cs="Times New Roman"/>
+          <w:b/>
+          <w:szCs w:val="24"/>
+        </w:rPr>
+      </w:pPr>
+      <w:r>
+        <w:rPr>
+          <w:rFonts w:cs="Times New Roman"/>
+          <w:b/>
+          <w:szCs w:val="24"/>
+        </w:rPr>
+        <w:t>BASICS (WEEKS 6–8)</w:t>
+      </w:r>
+    </w:p>
+    <w:p>
+      <w:pPr>
+        <w:rPr>
+          <w:rFonts w:cs="Times New Roman"/>
+          <w:b/>
+          <w:szCs w:val="24"/>
+        </w:rPr>
+      </w:pPr>
+      <w:r>
+        <w:rPr>
+          <w:rFonts w:cs="Times New Roman"/>
+          <w:b/>
+          <w:szCs w:val="24"/>
+        </w:rPr>
+        <w:t>2.4 DIGITAL IMAGE PROCESSING AND MULTISPECTRAL</w:t>
+      </w:r>
+    </w:p>
+    <w:p>
+      <w:pPr>
+        <w:rPr>
+          <w:rFonts w:cs="Times New Roman"/>
+          <w:b/>
+          <w:szCs w:val="24"/>
+        </w:rPr>
+      </w:pPr>
+      <w:r>
+        <w:rPr>
+          <w:rFonts w:cs="Times New Roman"/>
+          <w:b/>
+          <w:szCs w:val="24"/>
+        </w:rPr>
+        <w:t>CLASSIFICATION (WEEKS 9–12)</w:t>
+      </w:r>
+    </w:p>
+    <w:p>
+      <w:pPr>
+        <w:rPr>
+          <w:rFonts w:cs="Times New Roman"/>
+          <w:b/>
+          <w:szCs w:val="24"/>
+        </w:rPr>
+      </w:pPr>
+      <w:r>
+        <w:rPr>
+          <w:rFonts w:cs="Times New Roman"/>
+          <w:b/>
+          <w:szCs w:val="24"/>
+        </w:rPr>
+        <w:t>2.5 LULC CHANGE DETECTION AND ADVANCED SYMBOLOGY (WEEKS 13–15)</w:t>
+      </w:r>
+    </w:p>
+    <w:p>
+      <w:pPr>
+        <w:rPr>
+          <w:rFonts w:cs="Times New Roman"/>
+          <w:b/>
+          <w:szCs w:val="24"/>
+        </w:rPr>
+      </w:pPr>
+      <w:r>
+        <w:rPr>
+          <w:rFonts w:cs="Times New Roman"/>
+          <w:b/>
           <w:szCs w:val="24"/>
         </w:rPr>
         <w:lastRenderedPageBreak/>
-        <w:br w:type="page"/>
+        <w:t>2.6 BAND MATH, PCA, AND TRANSITION TO PYTHON FOR GIS (WEEK 16)</w:t>
+      </w:r>
+    </w:p>
+    <w:p>
+      <w:pPr>
+        <w:rPr>
+          <w:rFonts w:cs="Times New Roman"/>
+          <w:b/>
+          <w:szCs w:val="24"/>
+        </w:rPr>
+      </w:pPr>
+      <w:r>
+        <w:rPr>
+          <w:rFonts w:cs="Times New Roman"/>
+          <w:b/>
+          <w:szCs w:val="24"/>
+        </w:rPr>
+        <w:t>2.7 PROGRAMMATIC VECTOR AND RASTER DATA ENGINEERING (WEEKS 17–20)</w:t>
+      </w:r>
+    </w:p>
+    <w:p>
+      <w:pPr>
+        <w:rPr>
+          <w:rFonts w:cs="Times New Roman"/>
+          <w:b/>
+          <w:szCs w:val="24"/>
+        </w:rPr>
+      </w:pPr>
+      <w:r>
+        <w:rPr>
+          <w:rFonts w:cs="Times New Roman"/>
+          <w:b/>
+          <w:szCs w:val="24"/>
+        </w:rPr>
+        <w:t>2.8 SCIENTIFIC COMPUTING, MACHINE LEARNING LIBRARIES,</w:t>
+      </w:r>
+    </w:p>
+    <w:p>
+      <w:pPr>
+        <w:rPr>
+          <w:rFonts w:cs="Times New Roman"/>
+          <w:b/>
+          <w:szCs w:val="24"/>
+        </w:rPr>
+      </w:pPr>
+      <w:r>
+        <w:rPr>
+          <w:rFonts w:cs="Times New Roman"/>
+          <w:b/>
+          <w:szCs w:val="24"/>
+        </w:rPr>
+        <w:t>AND EDA (WEEKS 21–23)</w:t>
+      </w:r>
+    </w:p>
+    <w:p>
+      <w:pPr>
+        <w:rPr>
+          <w:rFonts w:cs="Times New Roman"/>
+          <w:b/>
+          <w:szCs w:val="24"/>
+        </w:rPr>
+      </w:pPr>
+      <w:r>
+        <w:rPr>
+          <w:rFonts w:cs="Times New Roman"/>
+          <w:b/>
+          <w:szCs w:val="24"/>
+        </w:rPr>
+        <w:t>2.9 CAPSTONE RESEARCH AND T</w:t>
+      </w:r>
+      <w:r>
+        <w:rPr>
+          <w:rFonts w:cs="Times New Roman"/>
+          <w:b/>
+          <w:szCs w:val="24"/>
+        </w:rPr>
+        <w:t>ECHNICAL PRESENTATION (WEEK 24)</w:t>
+      </w:r>
+    </w:p>
+    <w:p>
+      <w:pPr>
+        <w:rPr>
+          <w:rFonts w:cs="Times New Roman"/>
+          <w:b/>
+          <w:szCs w:val="24"/>
+        </w:rPr>
+      </w:pPr>
+      <w:r>
+        <w:rPr>
+          <w:rFonts w:cs="Times New Roman"/>
+          <w:b/>
+          <w:szCs w:val="24"/>
+        </w:rPr>
+        <w:t>CHAPTER 3: IT PROJECT ON GEOSPATIAL ANALYSIS OF URBAN</w:t>
+      </w:r>
+    </w:p>
+    <w:p>
+      <w:pPr>
+        <w:rPr>
+          <w:rFonts w:cs="Times New Roman"/>
+          <w:b/>
+          <w:szCs w:val="24"/>
+        </w:rPr>
+      </w:pPr>
+      <w:r>
+        <w:rPr>
+          <w:rFonts w:cs="Times New Roman"/>
+          <w:b/>
+          <w:szCs w:val="24"/>
+        </w:rPr>
+        <w:t>HEAT ISLAND DYNAMICS ...................................</w:t>
+      </w:r>
+      <w:r>
+        <w:rPr>
+          <w:rFonts w:cs="Times New Roman"/>
+          <w:b/>
+          <w:szCs w:val="24"/>
+        </w:rPr>
+        <w:t>.....................................................</w:t>
+      </w:r>
+      <w:r>
+        <w:rPr>
+          <w:rFonts w:cs="Times New Roman"/>
+          <w:b/>
+          <w:szCs w:val="24"/>
+        </w:rPr>
+        <w:t>13</w:t>
+      </w:r>
+    </w:p>
+    <w:p>
+      <w:pPr>
+        <w:rPr>
+          <w:rFonts w:cs="Times New Roman"/>
+          <w:b/>
+          <w:szCs w:val="24"/>
+        </w:rPr>
+      </w:pPr>
+      <w:r>
+        <w:rPr>
+          <w:rFonts w:cs="Times New Roman"/>
+          <w:b/>
+          <w:szCs w:val="24"/>
+        </w:rPr>
+        <w:t>3.1 PROJECT OVERVIEW</w:t>
+      </w:r>
+    </w:p>
+    <w:p>
+      <w:pPr>
+        <w:rPr>
+          <w:rFonts w:cs="Times New Roman"/>
+          <w:b/>
+          <w:szCs w:val="24"/>
+        </w:rPr>
+      </w:pPr>
+      <w:r>
+        <w:rPr>
+          <w:rFonts w:cs="Times New Roman"/>
+          <w:b/>
+          <w:szCs w:val="24"/>
+        </w:rPr>
+        <w:t>3.2 BACKGROUND OF THE STUDY</w:t>
+      </w:r>
+    </w:p>
+    <w:p>
+      <w:pPr>
+        <w:rPr>
+          <w:rFonts w:cs="Times New Roman"/>
+          <w:b/>
+          <w:szCs w:val="24"/>
+        </w:rPr>
+      </w:pPr>
+      <w:r>
+        <w:rPr>
+          <w:rFonts w:cs="Times New Roman"/>
+          <w:b/>
+          <w:szCs w:val="24"/>
+        </w:rPr>
+        <w:t>3.3 PROBLEM STATEMENT</w:t>
+      </w:r>
+    </w:p>
+    <w:p>
+      <w:pPr>
+        <w:rPr>
+          <w:rFonts w:cs="Times New Roman"/>
+          <w:b/>
+          <w:szCs w:val="24"/>
+        </w:rPr>
+      </w:pPr>
+      <w:r>
+        <w:rPr>
+          <w:rFonts w:cs="Times New Roman"/>
+          <w:b/>
+          <w:szCs w:val="24"/>
+        </w:rPr>
+        <w:t>3.4 AIM AND OBJECTIVES</w:t>
+      </w:r>
+    </w:p>
+    <w:p>
+      <w:pPr>
+        <w:rPr>
+          <w:rFonts w:cs="Times New Roman"/>
+          <w:b/>
+          <w:szCs w:val="24"/>
+        </w:rPr>
+      </w:pPr>
+      <w:r>
+        <w:rPr>
+          <w:rFonts w:cs="Times New Roman"/>
+          <w:b/>
+          <w:szCs w:val="24"/>
+        </w:rPr>
+        <w:t>3.5 DATA SOURCES AND ACQUISITION</w:t>
+      </w:r>
+    </w:p>
+    <w:p>
+      <w:pPr>
+        <w:rPr>
+          <w:rFonts w:cs="Times New Roman"/>
+          <w:b/>
+          <w:szCs w:val="24"/>
+        </w:rPr>
+      </w:pPr>
+      <w:r>
+        <w:rPr>
+          <w:rFonts w:cs="Times New Roman"/>
+          <w:b/>
+          <w:szCs w:val="24"/>
+        </w:rPr>
+        <w:t>3.6 METHODOLOGY AND TECHNICAL FORMULATIONS</w:t>
+      </w:r>
+    </w:p>
+    <w:p>
+      <w:pPr>
+        <w:rPr>
+          <w:rFonts w:cs="Times New Roman"/>
+          <w:b/>
+          <w:szCs w:val="24"/>
+        </w:rPr>
+      </w:pPr>
+      <w:r>
+        <w:rPr>
+          <w:rFonts w:cs="Times New Roman"/>
+          <w:b/>
+          <w:szCs w:val="24"/>
+        </w:rPr>
+        <w:t>3.7 DATA ANALYSIS, RESULTS, AND FINDINGS</w:t>
+      </w:r>
+    </w:p>
+    <w:p>
+      <w:pPr>
+        <w:rPr>
+          <w:rFonts w:cs="Times New Roman"/>
+          <w:b/>
+          <w:szCs w:val="24"/>
+        </w:rPr>
+      </w:pPr>
+      <w:r>
+        <w:rPr>
+          <w:rFonts w:cs="Times New Roman"/>
+          <w:b/>
+          <w:szCs w:val="24"/>
+        </w:rPr>
+        <w:t>3.8 ANALYSIS OF KEY FACTORS AND MICROCLIMATE DRIVERS</w:t>
+      </w:r>
+    </w:p>
+    <w:p>
+      <w:pPr>
+        <w:rPr>
+          <w:rFonts w:cs="Times New Roman"/>
+          <w:b/>
+          <w:szCs w:val="24"/>
+        </w:rPr>
+      </w:pPr>
+      <w:r>
+        <w:rPr>
+          <w:rFonts w:cs="Times New Roman"/>
+          <w:b/>
+          <w:szCs w:val="24"/>
+        </w:rPr>
+        <w:t>3.9 SYSTEM ARCHITECTURE AND CLOUD DEPLOYMENT</w:t>
+      </w:r>
+    </w:p>
+    <w:p>
+      <w:pPr>
+        <w:rPr>
+          <w:rFonts w:cs="Times New Roman"/>
+          <w:b/>
+          <w:szCs w:val="24"/>
+        </w:rPr>
+      </w:pPr>
+      <w:r>
+        <w:rPr>
+          <w:rFonts w:cs="Times New Roman"/>
+          <w:b/>
+          <w:szCs w:val="24"/>
+        </w:rPr>
+        <w:t>3.10 SCIENTIFIC LIMITATIONS OF THE STUDY</w:t>
+      </w:r>
+    </w:p>
+    <w:p>
+      <w:pPr>
+        <w:rPr>
+          <w:rFonts w:cs="Times New Roman"/>
+          <w:b/>
+          <w:szCs w:val="24"/>
+        </w:rPr>
+      </w:pPr>
+      <w:r>
+        <w:rPr>
+          <w:rFonts w:cs="Times New Roman"/>
+          <w:b/>
+          <w:szCs w:val="24"/>
+        </w:rPr>
+        <w:t>3.11</w:t>
+      </w:r>
+      <w:r>
+        <w:rPr>
+          <w:rFonts w:cs="Times New Roman"/>
+          <w:b/>
+          <w:szCs w:val="24"/>
+        </w:rPr>
+        <w:t xml:space="preserve"> CONCLUSION AND RECOMMENDATIONS…...............................................17</w:t>
+      </w:r>
+    </w:p>
+    <w:p>
+      <w:pPr>
+        <w:rPr>
+          <w:rFonts w:cs="Times New Roman"/>
+          <w:b/>
+          <w:szCs w:val="24"/>
+        </w:rPr>
+      </w:pPr>
+      <w:r>
+        <w:rPr>
+          <w:rFonts w:cs="Times New Roman"/>
+          <w:b/>
+          <w:szCs w:val="24"/>
+        </w:rPr>
+        <w:t>REFERENCES ............................</w:t>
+      </w:r>
+      <w:r>
+        <w:rPr>
+          <w:rFonts w:cs="Times New Roman"/>
+          <w:b/>
+          <w:szCs w:val="24"/>
+        </w:rPr>
+        <w:t>....................................................................................</w:t>
+      </w:r>
+      <w:r>
+        <w:rPr>
+          <w:rFonts w:cs="Times New Roman"/>
+          <w:b/>
+          <w:szCs w:val="24"/>
+        </w:rPr>
+        <w:t>18</w:t>
+      </w:r>
+    </w:p>
+    <w:p>
+      <w:pPr>
+        <w:rPr>
+          <w:rFonts w:cs="Times New Roman"/>
+          <w:b/>
+          <w:szCs w:val="24"/>
+        </w:rPr>
+      </w:pPr>
+      <w:r>
+        <w:rPr>
+          <w:rFonts w:cs="Times New Roman"/>
+          <w:b/>
+          <w:szCs w:val="24"/>
+        </w:rPr>
+        <w:t>APPENDICES ..............................</w:t>
+      </w:r>
+      <w:r>
+        <w:rPr>
+          <w:rFonts w:cs="Times New Roman"/>
+          <w:b/>
+          <w:szCs w:val="24"/>
+        </w:rPr>
+        <w:t>...................................................................................</w:t>
+      </w:r>
+      <w:r>
+        <w:rPr>
+          <w:rFonts w:cs="Times New Roman"/>
+          <w:b/>
+          <w:szCs w:val="24"/>
+        </w:rPr>
+        <w:t>19</w:t>
+      </w:r>
+    </w:p>
+    <w:p>
+      <w:pPr>
+        <w:rPr>
+          <w:rFonts w:cs="Times New Roman"/>
+          <w:b/>
+          <w:szCs w:val="24"/>
+        </w:rPr>
+      </w:pPr>
+      <w:r>
+        <w:rPr>
+          <w:rFonts w:cs="Times New Roman"/>
+          <w:b/>
+          <w:szCs w:val="24"/>
+        </w:rPr>
+        <w:t>APPENDIX A: COMPLETE CHRONOLOGICAL SIWES LOGBOOK</w:t>
+      </w:r>
+    </w:p>
+    <w:p>
+      <w:pPr>
+        <w:rPr>
+          <w:rFonts w:cs="Times New Roman"/>
+          <w:b/>
+          <w:szCs w:val="24"/>
+        </w:rPr>
+      </w:pPr>
+      <w:r>
+        <w:rPr>
+          <w:rFonts w:cs="Times New Roman"/>
+          <w:b/>
+          <w:szCs w:val="24"/>
+        </w:rPr>
+        <w:t>(WEEKS 1–24) ....................</w:t>
+      </w:r>
+      <w:r>
+        <w:rPr>
+          <w:rFonts w:cs="Times New Roman"/>
+          <w:b/>
+          <w:szCs w:val="24"/>
+        </w:rPr>
+        <w:t>............................................................................................</w:t>
+      </w:r>
+      <w:r>
+        <w:rPr>
+          <w:rFonts w:cs="Times New Roman"/>
+          <w:b/>
+          <w:szCs w:val="24"/>
+        </w:rPr>
+        <w:t>19</w:t>
+      </w:r>
+    </w:p>
+    <w:p>
+      <w:pPr>
+        <w:rPr>
+          <w:rFonts w:cs="Times New Roman"/>
+          <w:b/>
+          <w:szCs w:val="24"/>
+        </w:rPr>
+      </w:pPr>
+      <w:r>
+        <w:rPr>
+          <w:rFonts w:cs="Times New Roman"/>
+          <w:b/>
+          <w:szCs w:val="24"/>
+        </w:rPr>
+        <w:t>APPENDIX B: CORE SATELLITE EXTRACT</w:t>
+      </w:r>
+      <w:r>
+        <w:rPr>
+          <w:rFonts w:cs="Times New Roman"/>
+          <w:b/>
+          <w:szCs w:val="24"/>
+        </w:rPr>
+        <w:t>ION PIPELINE SOURCE CODE ……………………………………………………………………………………………</w:t>
+      </w:r>
+      <w:r>
+        <w:rPr>
+          <w:rFonts w:cs="Times New Roman"/>
+          <w:b/>
+          <w:szCs w:val="24"/>
+        </w:rPr>
+        <w:t>30</w:t>
+      </w:r>
+    </w:p>
+    <w:p>
+      <w:pPr>
+        <w:rPr>
+          <w:rFonts w:cs="Times New Roman"/>
+          <w:b/>
+          <w:szCs w:val="24"/>
+        </w:rPr>
+        <w:sectPr>
+          <w:footerReference w:type="default" r:id="rId10"/>
+          <w:pgSz w:w="12240" w:h="15840"/>
+          <w:pgMar w:top="1440" w:right="1800" w:bottom="1440" w:left="1800" w:header="720" w:footer="720" w:gutter="0"/>
+          <w:pgNumType w:fmt="lowerRoman" w:start="1"/>
+          <w:cols w:space="720"/>
+          <w:titlePg/>
+          <w:docGrid w:linePitch="360"/>
+        </w:sectPr>
+      </w:pPr>
+      <w:r>
+        <w:rPr>
+          <w:rFonts w:cs="Times New Roman"/>
+          <w:b/>
+          <w:szCs w:val="24"/>
+        </w:rPr>
+        <w:t>APPENDIX C: WEB APPLIC</w:t>
+      </w:r>
+      <w:r>
+        <w:rPr>
+          <w:rFonts w:cs="Times New Roman"/>
+          <w:b/>
+          <w:szCs w:val="24"/>
+        </w:rPr>
+        <w:t>ATION DEP</w:t>
+      </w:r>
+      <w:r>
+        <w:rPr>
+          <w:rFonts w:cs="Times New Roman"/>
+          <w:b/>
+          <w:szCs w:val="24"/>
+        </w:rPr>
+        <w:t>LOYMENT SPECIFICATIONS.........</w:t>
+      </w:r>
+      <w:r>
+        <w:rPr>
+          <w:rFonts w:cs="Times New Roman"/>
+          <w:b/>
+          <w:szCs w:val="24"/>
+        </w:rPr>
+        <w:t>32</w:t>
       </w:r>
     </w:p>
     <w:p>
@@ -6308,7 +7303,7 @@
         </w:rPr>
         <w:t xml:space="preserve">• Public Web Application URL: </w:t>
       </w:r>
-      <w:hyperlink r:id="rId9" w:history="1">
+      <w:hyperlink r:id="rId11" w:history="1">
         <w:r>
           <w:rPr>
             <w:rStyle w:val="Hyperlink"/>
@@ -6388,17 +7383,11 @@
       </w:r>
     </w:p>
     <w:sectPr>
-      <w:headerReference w:type="even" r:id="rId10"/>
-      <w:headerReference w:type="default" r:id="rId11"/>
-      <w:footerReference w:type="even" r:id="rId12"/>
-      <w:footerReference w:type="default" r:id="rId13"/>
-      <w:headerReference w:type="first" r:id="rId14"/>
-      <w:footerReference w:type="first" r:id="rId15"/>
+      <w:headerReference w:type="default" r:id="rId12"/>
       <w:pgSz w:w="12240" w:h="15840"/>
       <w:pgMar w:top="1440" w:right="1800" w:bottom="1440" w:left="1800" w:header="720" w:footer="720" w:gutter="0"/>
       <w:pgNumType w:start="1"/>
       <w:cols w:space="720"/>
-      <w:titlePg/>
       <w:docGrid w:linePitch="360"/>
     </w:sectPr>
   </w:body>
@@ -6432,19 +7421,9 @@
 
 <file path=word/footer1.xml><?xml version="1.0" encoding="utf-8"?>
 <w:ftr xmlns:wpc="http://schemas.microsoft.com/office/word/2010/wordprocessingCanvas" xmlns:mc="http://schemas.openxmlformats.org/markup-compatibility/2006" xmlns:o="urn:schemas-microsoft-com:office:office" xmlns:r="http://schemas.openxmlformats.org/officeDocument/2006/relationships" xmlns:m="http://schemas.openxmlformats.org/officeDocument/2006/math" xmlns:v="urn:schemas-microsoft-com:vml" xmlns:wp14="http://schemas.microsoft.com/office/word/2010/wordprocessingDrawing" xmlns:wp="http://schemas.openxmlformats.org/drawingml/2006/wordprocessingDrawing" xmlns:w10="urn:schemas-microsoft-com:office:word" xmlns:w="http://schemas.openxmlformats.org/wordprocessingml/2006/main" xmlns:w14="http://schemas.microsoft.com/office/word/2010/wordml" xmlns:wpg="http://schemas.microsoft.com/office/word/2010/wordprocessingGroup" xmlns:wpi="http://schemas.microsoft.com/office/word/2010/wordprocessingInk" xmlns:wne="http://schemas.microsoft.com/office/word/2006/wordml" xmlns:wps="http://schemas.microsoft.com/office/word/2010/wordprocessingShape" mc:Ignorable="w14 wp14">
-  <w:p>
-    <w:pPr>
-      <w:pStyle w:val="Footer"/>
-    </w:pPr>
-  </w:p>
-</w:ftr>
-</file>
-
-<file path=word/footer2.xml><?xml version="1.0" encoding="utf-8"?>
-<w:ftr xmlns:wpc="http://schemas.microsoft.com/office/word/2010/wordprocessingCanvas" xmlns:mc="http://schemas.openxmlformats.org/markup-compatibility/2006" xmlns:o="urn:schemas-microsoft-com:office:office" xmlns:r="http://schemas.openxmlformats.org/officeDocument/2006/relationships" xmlns:m="http://schemas.openxmlformats.org/officeDocument/2006/math" xmlns:v="urn:schemas-microsoft-com:vml" xmlns:wp14="http://schemas.microsoft.com/office/word/2010/wordprocessingDrawing" xmlns:wp="http://schemas.openxmlformats.org/drawingml/2006/wordprocessingDrawing" xmlns:w10="urn:schemas-microsoft-com:office:word" xmlns:w="http://schemas.openxmlformats.org/wordprocessingml/2006/main" xmlns:w14="http://schemas.microsoft.com/office/word/2010/wordml" xmlns:wpg="http://schemas.microsoft.com/office/word/2010/wordprocessingGroup" xmlns:wpi="http://schemas.microsoft.com/office/word/2010/wordprocessingInk" xmlns:wne="http://schemas.microsoft.com/office/word/2006/wordml" xmlns:wps="http://schemas.microsoft.com/office/word/2010/wordprocessingShape" mc:Ignorable="w14 wp14">
   <w:sdt>
     <w:sdtPr>
-      <w:id w:val="1657347801"/>
+      <w:id w:val="353930456"/>
       <w:docPartObj>
         <w:docPartGallery w:val="Page Numbers (Bottom of Page)"/>
         <w:docPartUnique/>
@@ -6459,7 +7438,7 @@
       <w:p>
         <w:pPr>
           <w:pStyle w:val="Footer"/>
-          <w:jc w:val="right"/>
+          <w:jc w:val="center"/>
         </w:pPr>
         <w:r>
           <w:fldChar w:fldCharType="begin"/>
@@ -6474,7 +7453,7 @@
           <w:rPr>
             <w:noProof/>
           </w:rPr>
-          <w:t>39</w:t>
+          <w:t>ii</w:t>
         </w:r>
         <w:r>
           <w:rPr>
@@ -6493,16 +7472,6 @@
 </w:ftr>
 </file>
 
-<file path=word/footer3.xml><?xml version="1.0" encoding="utf-8"?>
-<w:ftr xmlns:wpc="http://schemas.microsoft.com/office/word/2010/wordprocessingCanvas" xmlns:mc="http://schemas.openxmlformats.org/markup-compatibility/2006" xmlns:o="urn:schemas-microsoft-com:office:office" xmlns:r="http://schemas.openxmlformats.org/officeDocument/2006/relationships" xmlns:m="http://schemas.openxmlformats.org/officeDocument/2006/math" xmlns:v="urn:schemas-microsoft-com:vml" xmlns:wp14="http://schemas.microsoft.com/office/word/2010/wordprocessingDrawing" xmlns:wp="http://schemas.openxmlformats.org/drawingml/2006/wordprocessingDrawing" xmlns:w10="urn:schemas-microsoft-com:office:word" xmlns:w="http://schemas.openxmlformats.org/wordprocessingml/2006/main" xmlns:w14="http://schemas.microsoft.com/office/word/2010/wordml" xmlns:wpg="http://schemas.microsoft.com/office/word/2010/wordprocessingGroup" xmlns:wpi="http://schemas.microsoft.com/office/word/2010/wordprocessingInk" xmlns:wne="http://schemas.microsoft.com/office/word/2006/wordml" xmlns:wps="http://schemas.microsoft.com/office/word/2010/wordprocessingShape" mc:Ignorable="w14 wp14">
-  <w:p>
-    <w:pPr>
-      <w:pStyle w:val="Footer"/>
-    </w:pPr>
-  </w:p>
-</w:ftr>
-</file>
-
 <file path=word/footnotes.xml><?xml version="1.0" encoding="utf-8"?>
 <w:footnotes xmlns:wpc="http://schemas.microsoft.com/office/word/2010/wordprocessingCanvas" xmlns:mc="http://schemas.openxmlformats.org/markup-compatibility/2006" xmlns:o="urn:schemas-microsoft-com:office:office" xmlns:r="http://schemas.openxmlformats.org/officeDocument/2006/relationships" xmlns:m="http://schemas.openxmlformats.org/officeDocument/2006/math" xmlns:v="urn:schemas-microsoft-com:vml" xmlns:wp14="http://schemas.microsoft.com/office/word/2010/wordprocessingDrawing" xmlns:wp="http://schemas.openxmlformats.org/drawingml/2006/wordprocessingDrawing" xmlns:w10="urn:schemas-microsoft-com:office:word" xmlns:w="http://schemas.openxmlformats.org/wordprocessingml/2006/main" xmlns:w14="http://schemas.microsoft.com/office/word/2010/wordml" xmlns:wpg="http://schemas.microsoft.com/office/word/2010/wordprocessingGroup" xmlns:wpi="http://schemas.microsoft.com/office/word/2010/wordprocessingInk" xmlns:wne="http://schemas.microsoft.com/office/word/2006/wordml" xmlns:wps="http://schemas.microsoft.com/office/word/2010/wordprocessingShape" mc:Ignorable="w14 wp14">
   <w:footnote w:type="separator" w:id="-1">
@@ -6534,28 +7503,6 @@
     <w:pPr>
       <w:pStyle w:val="Header"/>
     </w:pPr>
-  </w:p>
-</w:hdr>
-</file>
-
-<file path=word/header2.xml><?xml version="1.0" encoding="utf-8"?>
-<w:hdr xmlns:wpc="http://schemas.microsoft.com/office/word/2010/wordprocessingCanvas" xmlns:mc="http://schemas.openxmlformats.org/markup-compatibility/2006" xmlns:o="urn:schemas-microsoft-com:office:office" xmlns:r="http://schemas.openxmlformats.org/officeDocument/2006/relationships" xmlns:m="http://schemas.openxmlformats.org/officeDocument/2006/math" xmlns:v="urn:schemas-microsoft-com:vml" xmlns:wp14="http://schemas.microsoft.com/office/word/2010/wordprocessingDrawing" xmlns:wp="http://schemas.openxmlformats.org/drawingml/2006/wordprocessingDrawing" xmlns:w10="urn:schemas-microsoft-com:office:word" xmlns:w="http://schemas.openxmlformats.org/wordprocessingml/2006/main" xmlns:w14="http://schemas.microsoft.com/office/word/2010/wordml" xmlns:wpg="http://schemas.microsoft.com/office/word/2010/wordprocessingGroup" xmlns:wpi="http://schemas.microsoft.com/office/word/2010/wordprocessingInk" xmlns:wne="http://schemas.microsoft.com/office/word/2006/wordml" xmlns:wps="http://schemas.microsoft.com/office/word/2010/wordprocessingShape" mc:Ignorable="w14 wp14">
-  <w:p>
-    <w:pPr>
-      <w:pStyle w:val="Header"/>
-    </w:pPr>
-  </w:p>
-</w:hdr>
-</file>
-
-<file path=word/header3.xml><?xml version="1.0" encoding="utf-8"?>
-<w:hdr xmlns:wpc="http://schemas.microsoft.com/office/word/2010/wordprocessingCanvas" xmlns:mc="http://schemas.openxmlformats.org/markup-compatibility/2006" xmlns:o="urn:schemas-microsoft-com:office:office" xmlns:r="http://schemas.openxmlformats.org/officeDocument/2006/relationships" xmlns:m="http://schemas.openxmlformats.org/officeDocument/2006/math" xmlns:v="urn:schemas-microsoft-com:vml" xmlns:wp14="http://schemas.microsoft.com/office/word/2010/wordprocessingDrawing" xmlns:wp="http://schemas.openxmlformats.org/drawingml/2006/wordprocessingDrawing" xmlns:w10="urn:schemas-microsoft-com:office:word" xmlns:w="http://schemas.openxmlformats.org/wordprocessingml/2006/main" xmlns:w14="http://schemas.microsoft.com/office/word/2010/wordml" xmlns:wpg="http://schemas.microsoft.com/office/word/2010/wordprocessingGroup" xmlns:wpi="http://schemas.microsoft.com/office/word/2010/wordprocessingInk" xmlns:wne="http://schemas.microsoft.com/office/word/2006/wordml" xmlns:wps="http://schemas.microsoft.com/office/word/2010/wordprocessingShape" mc:Ignorable="w14 wp14">
-  <w:p>
-    <w:pPr>
-      <w:pStyle w:val="Header"/>
-    </w:pPr>
-    <w:bookmarkStart w:id="0" w:name="_GoBack"/>
-    <w:bookmarkEnd w:id="0"/>
   </w:p>
 </w:hdr>
 </file>
@@ -18620,6 +19567,36 @@
       <w:u w:val="single"/>
     </w:rPr>
   </w:style>
+  <w:style w:type="paragraph" w:styleId="BalloonText">
+    <w:name w:val="Balloon Text"/>
+    <w:basedOn w:val="Normal"/>
+    <w:link w:val="BalloonTextChar"/>
+    <w:uiPriority w:val="99"/>
+    <w:semiHidden/>
+    <w:unhideWhenUsed/>
+    <w:rsid w:val="009B12C7"/>
+    <w:pPr>
+      <w:spacing w:after="0" w:line="240" w:lineRule="auto"/>
+    </w:pPr>
+    <w:rPr>
+      <w:rFonts w:ascii="Tahoma" w:hAnsi="Tahoma" w:cs="Tahoma"/>
+      <w:sz w:val="16"/>
+      <w:szCs w:val="16"/>
+    </w:rPr>
+  </w:style>
+  <w:style w:type="character" w:customStyle="1" w:styleId="BalloonTextChar">
+    <w:name w:val="Balloon Text Char"/>
+    <w:basedOn w:val="DefaultParagraphFont"/>
+    <w:link w:val="BalloonText"/>
+    <w:uiPriority w:val="99"/>
+    <w:semiHidden/>
+    <w:rsid w:val="009B12C7"/>
+    <w:rPr>
+      <w:rFonts w:ascii="Tahoma" w:hAnsi="Tahoma" w:cs="Tahoma"/>
+      <w:sz w:val="16"/>
+      <w:szCs w:val="16"/>
+    </w:rPr>
+  </w:style>
 </w:styles>
 </file>
 
@@ -30478,6 +31455,36 @@
     <w:rPr>
       <w:color w:val="0000FF" w:themeColor="hyperlink"/>
       <w:u w:val="single"/>
+    </w:rPr>
+  </w:style>
+  <w:style w:type="paragraph" w:styleId="BalloonText">
+    <w:name w:val="Balloon Text"/>
+    <w:basedOn w:val="Normal"/>
+    <w:link w:val="BalloonTextChar"/>
+    <w:uiPriority w:val="99"/>
+    <w:semiHidden/>
+    <w:unhideWhenUsed/>
+    <w:rsid w:val="009B12C7"/>
+    <w:pPr>
+      <w:spacing w:after="0" w:line="240" w:lineRule="auto"/>
+    </w:pPr>
+    <w:rPr>
+      <w:rFonts w:ascii="Tahoma" w:hAnsi="Tahoma" w:cs="Tahoma"/>
+      <w:sz w:val="16"/>
+      <w:szCs w:val="16"/>
+    </w:rPr>
+  </w:style>
+  <w:style w:type="character" w:customStyle="1" w:styleId="BalloonTextChar">
+    <w:name w:val="Balloon Text Char"/>
+    <w:basedOn w:val="DefaultParagraphFont"/>
+    <w:link w:val="BalloonText"/>
+    <w:uiPriority w:val="99"/>
+    <w:semiHidden/>
+    <w:rsid w:val="009B12C7"/>
+    <w:rPr>
+      <w:rFonts w:ascii="Tahoma" w:hAnsi="Tahoma" w:cs="Tahoma"/>
+      <w:sz w:val="16"/>
+      <w:szCs w:val="16"/>
     </w:rPr>
   </w:style>
 </w:styles>
@@ -30808,7 +31815,7 @@
 </file>
 
 <file path=customXml/itemProps1.xml><?xml version="1.0" encoding="utf-8"?>
-<ds:datastoreItem xmlns:ds="http://schemas.openxmlformats.org/officeDocument/2006/customXml" ds:itemID="{6B85FBF6-EDA3-4B00-8FA1-84C6D1A944A3}">
+<ds:datastoreItem xmlns:ds="http://schemas.openxmlformats.org/officeDocument/2006/customXml" ds:itemID="{BDD8D42A-8A4C-43A4-998F-CCF032558E45}">
   <ds:schemaRefs>
     <ds:schemaRef ds:uri="http://schemas.openxmlformats.org/officeDocument/2006/bibliography"/>
   </ds:schemaRefs>

</xml_diff>